<commit_message>
v1.4.4: fix white paper subsection renumbering regression, add Project Identity to README TOC
</commit_message>
<xml_diff>
--- a/docs/SatoshiShield_WhitePaper_v1_4.docx
+++ b/docs/SatoshiShield_WhitePaper_v1_4.docx
@@ -7284,7 +7284,7 @@
           <w:sz w:val="28"/>
           <w:szCs w:val="28"/>
         </w:rPr>
-        <w:t xml:space="preserve">8.1 Domain Rotation</w:t>
+        <w:t xml:space="preserve">9.1 Domain Rotation</w:t>
       </w:r>
     </w:p>
     <w:p>
@@ -7425,7 +7425,7 @@
           <w:sz w:val="28"/>
           <w:szCs w:val="28"/>
         </w:rPr>
-        <w:t xml:space="preserve">8.2 CDN Masking</w:t>
+        <w:t xml:space="preserve">9.2 CDN Masking</w:t>
       </w:r>
     </w:p>
     <w:p>
@@ -7528,7 +7528,7 @@
           <w:sz w:val="28"/>
           <w:szCs w:val="28"/>
         </w:rPr>
-        <w:t xml:space="preserve">8.3 Hardcoded IP Addresses</w:t>
+        <w:t xml:space="preserve">9.3 Hardcoded IP Addresses</w:t>
       </w:r>
     </w:p>
     <w:p>
@@ -7704,7 +7704,7 @@
           <w:sz w:val="28"/>
           <w:szCs w:val="28"/>
         </w:rPr>
-        <w:t xml:space="preserve">8.4 Legitimate Domain Camouflage</w:t>
+        <w:t xml:space="preserve">9.4 Legitimate Domain Camouflage</w:t>
       </w:r>
     </w:p>
     <w:p>
@@ -7826,7 +7826,7 @@
           <w:sz w:val="28"/>
           <w:szCs w:val="28"/>
         </w:rPr>
-        <w:t xml:space="preserve">8.5 Legal Threats</w:t>
+        <w:t xml:space="preserve">9.5 Legal Threats</w:t>
       </w:r>
     </w:p>
     <w:p>
@@ -7967,7 +7967,7 @@
           <w:sz w:val="28"/>
           <w:szCs w:val="28"/>
         </w:rPr>
-        <w:t xml:space="preserve">8.6 Community Infiltration</w:t>
+        <w:t xml:space="preserve">9.6 Community Infiltration</w:t>
       </w:r>
     </w:p>
     <w:p>
@@ -8108,7 +8108,7 @@
           <w:sz w:val="28"/>
           <w:szCs w:val="28"/>
         </w:rPr>
-        <w:t xml:space="preserve">8.7 Project Irrelevance</w:t>
+        <w:t xml:space="preserve">9.7 Project Irrelevance</w:t>
       </w:r>
     </w:p>
     <w:p>
@@ -8197,7 +8197,7 @@
           <w:sz w:val="28"/>
           <w:szCs w:val="28"/>
         </w:rPr>
-        <w:t xml:space="preserve">8.8 Countermeasure Summary</w:t>
+        <w:t xml:space="preserve">9.8 Countermeasure Summary</w:t>
       </w:r>
     </w:p>
     <w:tbl>

</xml_diff>